<commit_message>
Justify the sample length in section 8.3 and the README
The sixteen-year span was stated in section 5.1 but never defended. Section
8.3 gains a "Sample length" paragraph: the span yields twelve annual folds,
ten of which enter the common window; fold count rather than calendar length
binds the DM and Holm procedures, a longer sample would put pre-2010 market
structure in every fold's training set under the expanding window and deepen
the survivorship bias of 8.2; the tree's per-fold R2_OOS has no relationship
with training size across the 357 fold-ticker pairs (slope +2.0e-06,
t = +0.21, p = 0.838, results/fold_r2_oos.csv), which we decline to read as
evidence about history because fold index confounds training size with
calendar era; and a rolling window was not tested against the expanding one.

The README limitations table gains the short version beside the fold-count
row. The built paper is regenerated.
</commit_message>
<xml_diff>
--- a/docs/paper/build/paper_full.docx
+++ b/docs/paper/build/paper_full.docx
@@ -23,7 +23,7 @@
         <w:pStyle w:val="Date"/>
       </w:pPr>
       <w:r>
-        <w:t xml:space="preserve">6 September 2026</w:t>
+        <w:t xml:space="preserve">9 September 2026</w:t>
       </w:r>
     </w:p>
     <w:bookmarkStart w:id="9" w:name="abstract"/>
@@ -25212,6 +25212,183 @@
       </w:r>
       <w:r>
         <w:t xml:space="preserve">staleness rather than absence of signal.</w:t>
+      </w:r>
+    </w:p>
+    <w:p>
+      <w:pPr>
+        <w:pStyle w:val="BodyText"/>
+      </w:pPr>
+      <w:r>
+        <w:rPr>
+          <w:b/>
+          <w:bCs/>
+        </w:rPr>
+        <w:t xml:space="preserve">Sample length.</w:t>
+      </w:r>
+      <w:r>
+        <w:t xml:space="preserve"> </w:t>
+      </w:r>
+      <w:r>
+        <w:t xml:space="preserve">The sixteen years of daily history behind every run</w:t>
+      </w:r>
+      <w:r>
+        <w:t xml:space="preserve"> </w:t>
+      </w:r>
+      <w:r>
+        <w:t xml:space="preserve">(2010-03-16 to 2026-09-03 in the frozen AAPL file, 4,144 raw rows and 4,094</w:t>
+      </w:r>
+      <w:r>
+        <w:t xml:space="preserve"> </w:t>
+      </w:r>
+      <w:r>
+        <w:t xml:space="preserve">after feature warm-up; §5.1, §5.4) yield twelve annual folds under the</w:t>
+      </w:r>
+      <w:r>
+        <w:t xml:space="preserve"> </w:t>
+      </w:r>
+      <w:r>
+        <w:t xml:space="preserve">headline configuration, ten of which enter the common evaluation window.</w:t>
+      </w:r>
+      <w:r>
+        <w:t xml:space="preserve"> </w:t>
+      </w:r>
+      <w:r>
+        <w:t xml:space="preserve">Fold count rather than calendar length is the binding constraint on power:</w:t>
+      </w:r>
+      <w:r>
+        <w:t xml:space="preserve"> </w:t>
+      </w:r>
+      <w:r>
+        <w:t xml:space="preserve">the Diebold-Mariano tests, the Holm correction and the across-fold</w:t>
+      </w:r>
+      <w:r>
+        <w:t xml:space="preserve"> </w:t>
+      </w:r>
+      <w:r>
+        <w:t xml:space="preserve">aggregation of §5.7 all draw on the number of folds, so a shorter sample</w:t>
+      </w:r>
+      <w:r>
+        <w:t xml:space="preserve"> </w:t>
+      </w:r>
+      <w:r>
+        <w:t xml:space="preserve">would have left fewer of them for those procedures, while a longer one</w:t>
+      </w:r>
+      <w:r>
+        <w:t xml:space="preserve"> </w:t>
+      </w:r>
+      <w:r>
+        <w:t xml:space="preserve">would have placed pre-2010 market structure in every fold’s training set,</w:t>
+      </w:r>
+      <w:r>
+        <w:t xml:space="preserve"> </w:t>
+      </w:r>
+      <w:r>
+        <w:t xml:space="preserve">the expanding window never discarding its earliest rows, and would have</w:t>
+      </w:r>
+      <w:r>
+        <w:t xml:space="preserve"> </w:t>
+      </w:r>
+      <w:r>
+        <w:t xml:space="preserve">deepened the survivorship bias of §8.2, the universe having been selected</w:t>
+      </w:r>
+      <w:r>
+        <w:t xml:space="preserve"> </w:t>
+      </w:r>
+      <w:r>
+        <w:t xml:space="preserve">on tickers trading today. Whether the additional history helped is</w:t>
+      </w:r>
+      <w:r>
+        <w:t xml:space="preserve"> </w:t>
+      </w:r>
+      <w:r>
+        <w:t xml:space="preserve">testable, and it did not measurably: regressing the tree’s per-fold R²_OOS</w:t>
+      </w:r>
+      <w:r>
+        <w:t xml:space="preserve"> </w:t>
+      </w:r>
+      <w:r>
+        <w:t xml:space="preserve">on its fold’s training size across the 357 fold-ticker pairs gave no</w:t>
+      </w:r>
+      <w:r>
+        <w:t xml:space="preserve"> </w:t>
+      </w:r>
+      <w:r>
+        <w:t xml:space="preserve">relationship at all, a slope of +2.0 × 10⁻⁶ per training row with t = +0.21</w:t>
+      </w:r>
+      <w:r>
+        <w:t xml:space="preserve"> </w:t>
+      </w:r>
+      <w:r>
+        <w:t xml:space="preserve">and p = 0.838 (</w:t>
+      </w:r>
+      <w:r>
+        <w:rPr>
+          <w:rStyle w:val="VerbatimChar"/>
+        </w:rPr>
+        <w:t xml:space="preserve">results/fold_r2_oos.csv</w:t>
+      </w:r>
+      <w:r>
+        <w:t xml:space="preserve">). We do not read that as evidence</w:t>
+      </w:r>
+      <w:r>
+        <w:t xml:space="preserve"> </w:t>
+      </w:r>
+      <w:r>
+        <w:t xml:space="preserve">that history is worthless, because fold index is simultaneously training</w:t>
+      </w:r>
+      <w:r>
+        <w:t xml:space="preserve"> </w:t>
+      </w:r>
+      <w:r>
+        <w:t xml:space="preserve">size and calendar era under an expanding window and the two cannot be</w:t>
+      </w:r>
+      <w:r>
+        <w:t xml:space="preserve"> </w:t>
+      </w:r>
+      <w:r>
+        <w:t xml:space="preserve">separated: a later fold trains on more rows and is also scored on a</w:t>
+      </w:r>
+      <w:r>
+        <w:t xml:space="preserve"> </w:t>
+      </w:r>
+      <w:r>
+        <w:t xml:space="preserve">different market. The same regression on directional accuracy minus the</w:t>
+      </w:r>
+      <w:r>
+        <w:t xml:space="preserve"> </w:t>
+      </w:r>
+      <w:r>
+        <w:t xml:space="preserve">majority class had a nominally significant negative slope (t = −2.06)</w:t>
+      </w:r>
+      <w:r>
+        <w:t xml:space="preserve"> </w:t>
+      </w:r>
+      <w:r>
+        <w:t xml:space="preserve">explaining 1.2% of the variance, which we report for completeness and do</w:t>
+      </w:r>
+      <w:r>
+        <w:t xml:space="preserve"> </w:t>
+      </w:r>
+      <w:r>
+        <w:t xml:space="preserve">not interpret, the same confound applying with equal force at a hundredth</w:t>
+      </w:r>
+      <w:r>
+        <w:t xml:space="preserve"> </w:t>
+      </w:r>
+      <w:r>
+        <w:t xml:space="preserve">of the variance explained. We did not test a rolling window against the</w:t>
+      </w:r>
+      <w:r>
+        <w:t xml:space="preserve"> </w:t>
+      </w:r>
+      <w:r>
+        <w:t xml:space="preserve">expanding one; whether discarding the earliest training rows at each refit</w:t>
+      </w:r>
+      <w:r>
+        <w:t xml:space="preserve"> </w:t>
+      </w:r>
+      <w:r>
+        <w:t xml:space="preserve">would have improved either metric is a question this design cannot answer.</w:t>
       </w:r>
     </w:p>
     <w:p>

</xml_diff>